<commit_message>
Instrumento 20: actualizar linea de base (cruce Incidente-Caso 16/09) y corregir gasto verificable no respaldado
</commit_message>
<xml_diff>
--- a/01-relevamiento/Instrumentos_17_al_22.docx
+++ b/01-relevamiento/Instrumentos_17_al_22.docx
@@ -7783,7 +7783,7 @@
                 <w:szCs w:val="20"/>
                 <w:rtl w:val="0"/>
               </w:rPr>
-              <w:t xml:space="preserve">analistas de nivel uno, de forma continua (2.550 alertas accionables relevadas en una ventana de 24 hs, sobre 13 clientes)</w:t>
+              <w:t xml:space="preserve">analistas de nivel uno, de forma continua (3.882 alertas relevadas en una ventana de 24 hs del 16/09/2026, de las cuales 1.910 de severidad alta o media, sobre 13 clientes)</w:t>
             </w:r>
           </w:p>
         </w:tc>
@@ -7856,7 +7856,7 @@
                 <w:szCs w:val="20"/>
                 <w:rtl w:val="0"/>
               </w:rPr>
-              <w:t xml:space="preserve">Solo el 18,7% de las alertas accionables (476 de 2.550) muestra registro individual de asignación o notificación formal dentro de la misma ventana; el referente confirma que el cumplimiento de los SLA exige "al límite la capacidad de los turnos", y que escalar personal linealmente por cada cliente nuevo "no es sustentable, ni por costo ni por operación"</w:t>
+              <w:t xml:space="preserve">No se dispone de un costo o gasto verificable de este procedimiento: un cruce por identificador de incidente contra el registro de casos del mismo período (16/09/2026) muestra que solo el 1,34% de las alertas (5,88% entre las de severidad alta o crítica) queda vinculado a un caso efectivamente creado —cota inferior de cobertura formal, no una tasa de gasto ni de desatención comprobada—. Esta cifra describe cobertura de seguimiento, no un costo cuantificado; falta, para estimar el costo, el tiempo efectivo dedicado por alerta y su valorización. El referente confirma que el cumplimiento de los SLA exige "al límite la capacidad de los turnos", y que escalar personal linealmente por cada cliente nuevo "no es sustentable, ni por costo ni por operación"</w:t>
             </w:r>
           </w:p>
         </w:tc>
@@ -7929,7 +7929,7 @@
                 <w:szCs w:val="20"/>
                 <w:rtl w:val="0"/>
               </w:rPr>
-              <w:t xml:space="preserve">autoobservación (panel FortiSIEM, 25/08/2026) y entrevista con el referente del MSSP (04/09/2026)</w:t>
+              <w:t xml:space="preserve">autoobservación (panel FortiSIEM, 25/08/2026), cruce Incidente-Caso (FortiSIEM, 16/09/2026, cruzado con export de casos del 24/09/2026) y entrevista con el referente del MSSP (04/09/2026)</w:t>
             </w:r>
           </w:p>
         </w:tc>
@@ -8002,7 +8002,7 @@
                 <w:szCs w:val="20"/>
                 <w:rtl w:val="0"/>
               </w:rPr>
-              <w:t xml:space="preserve">ventana de 24 hs del 25/08/2026, más la apreciación acumulada del referente</w:t>
+              <w:t xml:space="preserve">ventana de 24 hs del 16/09/2026 (cruce Incidente-Caso), más la apreciación acumulada del referente</w:t>
             </w:r>
           </w:p>
         </w:tc>
@@ -8717,7 +8717,7 @@
                 <w:szCs w:val="20"/>
                 <w:rtl w:val="0"/>
               </w:rPr>
-              <w:t xml:space="preserve">Existe gasto verificable (brecha del 81,3%, tiempo de carga al límite de los turnos), pero la consecuencia de falla es una tendencia de riesgo creciente reconocida por el referente, no un incidente puntual ya ocurrido y documentado</w:t>
+              <w:t xml:space="preserve">Existe conducta observable —tiempo de carga de los turnos "al límite", declarado por el referente, y una cobertura de seguimiento formal verificada por cruce Incidente-Caso de solo 1,34% (5,88% en alta/crítica)—, pero no un gasto cuantificado: falta valorizar el tiempo efectivo dedicado por alerta para poder hablar de un gasto verificable en sentido estricto. La consecuencia de falla es, además, una tendencia de riesgo creciente reconocida por el referente, no un incidente puntual ya ocurrido y documentado. No se afirma un costo ni un incidente que no estén respaldados por estas fuentes.</w:t>
             </w:r>
           </w:p>
         </w:tc>

</xml_diff>